<commit_message>
Remove reference links, URLs, and external sources from phase-wise documents
</commit_message>
<xml_diff>
--- a/Internship_Submission/Brainstorming & Ideation Phase/Brainstorming- Idea Generation- Prioritizaation Template.docx
+++ b/Internship_Submission/Brainstorming & Ideation Phase/Brainstorming- Idea Generation- Prioritizaation Template.docx
@@ -331,37 +331,6 @@
           <w:rtl w:val="0"/>
         </w:rPr>
         <w:t xml:space="preserve">Use this template in your own brainstorming sessions so your team can unleash their imagination and start shaping concepts even if you're not sitting in the same room.</w:t>
-      </w:r>
-    </w:p>
-    <w:p>
-      <w:pPr>
-        <w:rPr>
-          <w:color w:val="0563c1"/>
-          <w:u w:val="single"/>
-        </w:rPr>
-      </w:pPr>
-      <w:r>
-        <w:rPr>
-          <w:sz w:val="24"/>
-          <w:szCs w:val="24"/>
-          <w:rtl w:val="0"/>
-        </w:rPr>
-        <w:t xml:space="preserve">Reference: </w:t>
-      </w:r>
-      <w:hyperlink r:id="rId7">
-        <w:r>
-          <w:rPr>
-            <w:color w:val="1155cc"/>
-            <w:u w:val="single"/>
-            <w:rtl w:val="0"/>
-          </w:rPr>
-          <w:t xml:space="preserve">https://www.mural.co/templates/brainstorm-and-idea-prioritization</w:t>
-        </w:r>
-      </w:hyperlink>
-      <w:r>
-        <w:rPr>
-          <w:rtl w:val="0"/>
-        </w:rPr>
       </w:r>
     </w:p>
     <w:p>

</xml_diff>

<commit_message>
Updated internship documentation with ShopEZ Swadeshi details
</commit_message>
<xml_diff>
--- a/Internship_Submission/Brainstorming & Ideation Phase/Brainstorming- Idea Generation- Prioritizaation Template.docx
+++ b/Internship_Submission/Brainstorming & Ideation Phase/Brainstorming- Idea Generation- Prioritizaation Template.docx
@@ -163,7 +163,7 @@
           <w:tcPr/>
           <w:p>
             <w:r>
-              <w:t>AeroTrade (Student: Arcot Yashashivini)</w:t>
+              <w:t>shopez_swadeshi (Student: Arcot Yashashivini)</w:t>
             </w:r>
           </w:p>
         </w:tc>
@@ -347,12 +347,12 @@
         <w:br/>
         <w:t>Description:</w:t>
         <w:br/>
-        <w:t>The project was undertaken individually by student Arcot Yashashivini on 17 June 2026. The selected problem statement revolves around stock market education and simulation. Traditional trading terminals are intimidating for beginners and involve actual financial risk, creating a high entry barrier. AeroTrade was conceptualized to solve these problems by providing a feature-rich, high-performance mock trading sandbox with real-time stock sync and administrative controls.</w:t>
+        <w:t>The project was undertaken individually by student Arcot Yashashivini on 17 June 2026. The selected problem statement revolves around stock market education and simulation. Traditional shopez_swadeshi terminals are intimidating for beginners and involve actual financial risk, creating a high entry barrier. shopez_swadeshi was conceptualized to solve these problems by providing a feature-rich, high-performance mock shopez_swadeshi sandbox with real-time stock sync and administrative controls.</w:t>
         <w:br/>
         <w:br/>
         <w:t>Description:</w:t>
         <w:br/>
-        <w:t>The project was undertaken individually by student Arcot Yashashivini on 17 June 2026. The selected problem statement revolves around stock market education and simulation. Traditional trading terminals are intimidating for beginners and involve actual financial risk, creating a high entry barrier. AeroTrade was conceptualized to solve these problems by providing a feature-rich, high-performance mock trading sandbox with real-time stock sync and administrative controls.</w:t>
+        <w:t>The project was undertaken individually by student Arcot Yashashivini on 17 June 2026. The selected problem statement revolves around stock market education and simulation. Traditional shopez_swadeshi terminals are intimidating for beginners and involve actual financial risk, creating a high entry barrier. shopez_swadeshi was conceptualized to solve these problems by providing a feature-rich, high-performance mock shopez_swadeshi sandbox with real-time stock sync and administrative controls.</w:t>
       </w:r>
     </w:p>
     <w:p>
@@ -446,7 +446,7 @@
         <w:br/>
         <w:t>1. Trader Dashboard (Frontend UI): Interactive Canvas Sparklines for 24h stock performance, sector allocation SVG breakdown, live indices calculations (S&amp;P 500, NASDAQ, DOW), automated portfolio trackers, custom price gauges, sliding watchlists, and scrolling news tickers.</w:t>
         <w:br/>
-        <w:t>2. Simulated Trading Engine (Core Logic): Mock buy/sell orders, live cash balance verification, average purchase price recalculations, and automated transaction loggers.</w:t>
+        <w:t>2. Simulated shopez_swadeshi Engine (Core Logic): Mock buy/sell orders, live cash balance verification, average purchase price recalculations, and automated transaction loggers.</w:t>
         <w:br/>
         <w:t>3. Administrative Portal (Backend Admin Controls): Secure admin CRUD (create, read, update, delete) controls for stock assets, and a platform-wide transaction ledger view.</w:t>
         <w:br/>
@@ -457,7 +457,7 @@
         <w:br/>
         <w:t>1. Trader Dashboard (Frontend UI): Interactive Canvas Sparklines for 24h stock performance, sector allocation SVG breakdown, live indices calculations (S&amp;P 500, NASDAQ, DOW), automated portfolio trackers, custom price gauges, sliding watchlists, and scrolling news tickers.</w:t>
         <w:br/>
-        <w:t>2. Simulated Trading Engine (Core Logic): Mock buy/sell orders, live cash balance verification, average purchase price recalculations, and automated transaction loggers.</w:t>
+        <w:t>2. Simulated shopez_swadeshi Engine (Core Logic): Mock buy/sell orders, live cash balance verification, average purchase price recalculations, and automated transaction loggers.</w:t>
         <w:br/>
         <w:t>3. Administrative Portal (Backend Admin Controls): Secure admin CRUD (create, read, update, delete) controls for stock assets, and a platform-wide transaction ledger view.</w:t>
       </w:r>

</xml_diff>